<commit_message>
Roehampton: Third Space demise takes the Pavilion terrace and the approach to the Sports Club door
</commit_message>
<xml_diff>
--- a/client/public/share/roehampton-sports-ground-estate-k7x2/docs/Roehampton - Third Space Heads of Terms - draft.docx
+++ b/client/public/share/roehampton-sports-ground-estate-k7x2/docs/Roehampton - Third Space Heads of Terms - draft.docx
@@ -638,6 +638,101 @@
                 <w:szCs w:val="21"/>
               </w:rPr>
               <w:t xml:space="preserve">27,765</w:t>
+            </w:r>
+          </w:p>
+        </w:tc>
+      </w:tr>
+      <w:tr>
+        <w:tc>
+          <w:tcPr>
+            <w:tcW w:type="dxa" w:w="1700"/>
+            <w:tcBorders>
+              <w:top w:val="single" w:color="D9CFC9" w:sz="4"/>
+              <w:left w:val="none" w:color="FFFFFF" w:sz="0"/>
+              <w:bottom w:val="single" w:color="D9CFC9" w:sz="4"/>
+              <w:right w:val="none" w:color="FFFFFF" w:sz="0"/>
+            </w:tcBorders>
+            <w:tcMar>
+              <w:top w:type="dxa" w:w="80"/>
+              <w:left w:type="dxa" w:w="110"/>
+              <w:bottom w:type="dxa" w:w="80"/>
+              <w:right w:type="dxa" w:w="110"/>
+            </w:tcMar>
+          </w:tcPr>
+          <w:p>
+            <w:pPr>
+              <w:spacing w:after="40" w:line="270"/>
+            </w:pPr>
+            <w:r>
+              <w:rPr>
+                <w:rFonts w:ascii="Calibri" w:cs="Calibri" w:eastAsia="Calibri" w:hAnsi="Calibri"/>
+                <w:color w:val="1D1D1B"/>
+                <w:sz w:val="21"/>
+                <w:szCs w:val="21"/>
+              </w:rPr>
+              <w:t xml:space="preserve">Terrace and approach</w:t>
+            </w:r>
+          </w:p>
+        </w:tc>
+        <w:tc>
+          <w:tcPr>
+            <w:tcW w:type="dxa" w:w="6060"/>
+            <w:tcBorders>
+              <w:top w:val="single" w:color="D9CFC9" w:sz="4"/>
+              <w:left w:val="none" w:color="FFFFFF" w:sz="0"/>
+              <w:bottom w:val="single" w:color="D9CFC9" w:sz="4"/>
+              <w:right w:val="none" w:color="FFFFFF" w:sz="0"/>
+            </w:tcBorders>
+            <w:tcMar>
+              <w:top w:type="dxa" w:w="80"/>
+              <w:left w:type="dxa" w:w="110"/>
+              <w:bottom w:type="dxa" w:w="80"/>
+              <w:right w:type="dxa" w:w="110"/>
+            </w:tcMar>
+          </w:tcPr>
+          <w:p>
+            <w:pPr>
+              <w:spacing w:after="40" w:line="270"/>
+            </w:pPr>
+            <w:r>
+              <w:rPr>
+                <w:rFonts w:ascii="Calibri" w:cs="Calibri" w:eastAsia="Calibri" w:hAnsi="Calibri"/>
+                <w:color w:val="1D1D1B"/>
+                <w:sz w:val="21"/>
+                <w:szCs w:val="21"/>
+              </w:rPr>
+              <w:t xml:space="preserve">The terrace and steps on the garden side of the Pavilion, about 7 m off the wall, and the paved approach from the Pavilion's south corner to the Sports Club west entrance, within the demise so that the Tenant controls its own frontage and the route between its two buildings.</w:t>
+            </w:r>
+          </w:p>
+        </w:tc>
+        <w:tc>
+          <w:tcPr>
+            <w:tcW w:type="dxa" w:w="1600"/>
+            <w:tcBorders>
+              <w:top w:val="single" w:color="D9CFC9" w:sz="4"/>
+              <w:left w:val="none" w:color="FFFFFF" w:sz="0"/>
+              <w:bottom w:val="single" w:color="D9CFC9" w:sz="4"/>
+              <w:right w:val="none" w:color="FFFFFF" w:sz="0"/>
+            </w:tcBorders>
+            <w:tcMar>
+              <w:top w:type="dxa" w:w="80"/>
+              <w:left w:type="dxa" w:w="110"/>
+              <w:bottom w:type="dxa" w:w="80"/>
+              <w:right w:type="dxa" w:w="110"/>
+            </w:tcMar>
+          </w:tcPr>
+          <w:p>
+            <w:pPr>
+              <w:spacing w:after="40" w:line="270"/>
+            </w:pPr>
+            <w:r>
+              <w:rPr>
+                <w:rFonts w:ascii="Calibri" w:cs="Calibri" w:eastAsia="Calibri" w:hAnsi="Calibri"/>
+                <w:color w:val="1D1D1B"/>
+                <w:sz w:val="21"/>
+                <w:szCs w:val="21"/>
+              </w:rPr>
+              <w:t xml:space="preserve">Within the demise</w:t>
             </w:r>
           </w:p>
         </w:tc>

</xml_diff>

<commit_message>
Roehampton: base case on Nick's observations and the Lighthouse survey; developer's shell works, 2 years capital, 1 year rent free; arrival area; HoTs with alienation
</commit_message>
<xml_diff>
--- a/client/public/share/roehampton-sports-ground-estate-k7x2/docs/Roehampton - Third Space Heads of Terms - draft.docx
+++ b/client/public/share/roehampton-sports-ground-estate-k7x2/docs/Roehampton - Third Space Heads of Terms - draft.docx
@@ -701,7 +701,7 @@
                 <w:sz w:val="21"/>
                 <w:szCs w:val="21"/>
               </w:rPr>
-              <w:t xml:space="preserve">One parcel with the buildings: the garden, terrace and forecourt on the west side of the Pavilion to the edge of the playing fields, the approach from the Pavilion to the Sports Club west entrance, and the grounds east and south of the Sports Club to the Tennis Centre fence and the eastern boundary, running down to the pitch. The Tenant controls its own frontage, its outdoor space and the route between its two buildings.</w:t>
+              <w:t xml:space="preserve">One parcel with the buildings: the garden, terrace and forecourt on the west side of the Pavilion to the edge of the playing fields, the approach from the Pavilion to the Sports Club west entrance, the grounds east and south of the Sports Club to the Tennis Centre fence and the eastern boundary running down to the pitch, and the arrival area on the car park side of the Sports Club, between the squash courts and the pitch down to the first car park bays, for landscaping, planting and a sense of arrival. The Tenant controls its own frontage, its outdoor space and the route between its two buildings.</w:t>
             </w:r>
           </w:p>
         </w:tc>
@@ -732,7 +732,7 @@
                 <w:sz w:val="21"/>
                 <w:szCs w:val="21"/>
               </w:rPr>
-              <w:t xml:space="preserve">c. 1.5 ha in all with the buildings and pitch</w:t>
+              <w:t xml:space="preserve">c. 1.6 ha in all with the buildings and pitch</w:t>
             </w:r>
           </w:p>
         </w:tc>
@@ -1162,7 +1162,7 @@
                 <w:sz w:val="21"/>
                 <w:szCs w:val="21"/>
               </w:rPr>
-              <w:t xml:space="preserve">20 years from completion of the Landlord's purchase, target January 2027, with no tenant break. [Landlord to consider a tenant break at year 15 on 12 months' notice if required.]</w:t>
+              <w:t xml:space="preserve">20 years from the lease start, with no tenant break. [Landlord to consider a tenant break at year 15 on 12 months' notice if required.]</w:t>
             </w:r>
           </w:p>
         </w:tc>
@@ -1197,7 +1197,7 @@
                 <w:sz w:val="21"/>
                 <w:szCs w:val="21"/>
               </w:rPr>
-              <w:t xml:space="preserve">Lease start</w:t>
+              <w:t xml:space="preserve">Alienation</w:t>
             </w:r>
           </w:p>
         </w:tc>
@@ -1228,7 +1228,7 @@
                 <w:sz w:val="21"/>
                 <w:szCs w:val="21"/>
               </w:rPr>
-              <w:t xml:space="preserve">On the day the Landlord completes its purchase, target January 2027, simultaneously with the All England Club's surrender and regrant. No Landlord's works: the premises are handed over as they stand and the Tenant fits out during the rent-free.</w:t>
+              <w:t xml:space="preserve">Assignment of the whole with the Landlord's consent, not to be unreasonably withheld or delayed, with an authorised guarantee agreement where reasonably required; no assignment of part. Underletting of the whole, or of the Pavilion or the Sports Club as a separate unit, with consent not to be unreasonably withheld, at the open market rent, contracted out of the 1954 Act, on terms consistent with this lease. Sharing with group companies and with concessionaires and franchisees in the ordinary course of a health club business without consent, on notice. Charging of the whole without consent to a bona fide lender.</w:t>
             </w:r>
           </w:p>
         </w:tc>
@@ -1263,7 +1263,7 @@
                 <w:sz w:val="21"/>
                 <w:szCs w:val="21"/>
               </w:rPr>
-              <w:t xml:space="preserve">Rent</w:t>
+              <w:t xml:space="preserve">Repair</w:t>
             </w:r>
           </w:p>
         </w:tc>
@@ -1294,7 +1294,7 @@
                 <w:sz w:val="21"/>
                 <w:szCs w:val="21"/>
               </w:rPr>
-              <w:t xml:space="preserve">£1,804,260 per annum exclusive, being £30.00 per sq ft GIA on 60,142 sq ft. The astro pitch and strip are included at no additional rent.</w:t>
+              <w:t xml:space="preserve">Full repairing and insuring, the Tenant to keep the premises in good and substantial repair and condition from the developer's shell handed over, with the Landlord's Works warranted or collateral warranties assigned to the Tenant. External and structural repair of the Landlord's Works items during a [24]-month defects period for the Landlord's account.</w:t>
             </w:r>
           </w:p>
         </w:tc>
@@ -1329,7 +1329,7 @@
                 <w:sz w:val="21"/>
                 <w:szCs w:val="21"/>
               </w:rPr>
-              <w:t xml:space="preserve">Rent free</w:t>
+              <w:t xml:space="preserve">Insurance</w:t>
             </w:r>
           </w:p>
         </w:tc>
@@ -1360,7 +1360,7 @@
                 <w:sz w:val="21"/>
                 <w:szCs w:val="21"/>
               </w:rPr>
-              <w:t xml:space="preserve">24 months from completion, so 2027 and 2028. Rent is payable from 1 January 2029.</w:t>
+              <w:t xml:space="preserve">Landlord insures the buildings for full reinstatement and three years' loss of rent; Tenant reimburses the premium and insures its own fit-out, contents and plate glass. Rent suspension and a mutual right to determine if not reinstated within three years.</w:t>
             </w:r>
           </w:p>
         </w:tc>
@@ -1395,6 +1395,534 @@
                 <w:sz w:val="21"/>
                 <w:szCs w:val="21"/>
               </w:rPr>
+              <w:t xml:space="preserve">Service charge and estate</w:t>
+            </w:r>
+          </w:p>
+        </w:tc>
+        <w:tc>
+          <w:tcPr>
+            <w:tcW w:type="dxa" w:w="6760"/>
+            <w:tcBorders>
+              <w:top w:val="single" w:color="D9CFC9" w:sz="4"/>
+              <w:left w:val="none" w:color="FFFFFF" w:sz="0"/>
+              <w:bottom w:val="single" w:color="D9CFC9" w:sz="4"/>
+              <w:right w:val="none" w:color="FFFFFF" w:sz="0"/>
+            </w:tcBorders>
+            <w:tcMar>
+              <w:top w:type="dxa" w:w="80"/>
+              <w:left w:type="dxa" w:w="110"/>
+              <w:bottom w:type="dxa" w:w="80"/>
+              <w:right w:type="dxa" w:w="110"/>
+            </w:tcMar>
+          </w:tcPr>
+          <w:p>
+            <w:pPr>
+              <w:spacing w:after="40" w:line="270"/>
+            </w:pPr>
+            <w:r>
+              <w:rPr>
+                <w:rFonts w:ascii="Calibri" w:cs="Calibri" w:eastAsia="Calibri" w:hAnsi="Calibri"/>
+                <w:color w:val="1D1D1B"/>
+                <w:sz w:val="21"/>
+                <w:szCs w:val="21"/>
+              </w:rPr>
+              <w:t xml:space="preserve">A fair proportion of the cost of maintaining the estate roads, both Bank Lane gates, car park A, lighting, landscaping and security, with a budget to be agreed and capped for the first [three] years at [£] per annum indexed.</w:t>
+            </w:r>
+          </w:p>
+        </w:tc>
+      </w:tr>
+      <w:tr>
+        <w:tc>
+          <w:tcPr>
+            <w:tcW w:type="dxa" w:w="2600"/>
+            <w:tcBorders>
+              <w:top w:val="single" w:color="D9CFC9" w:sz="4"/>
+              <w:left w:val="none" w:color="FFFFFF" w:sz="0"/>
+              <w:bottom w:val="single" w:color="D9CFC9" w:sz="4"/>
+              <w:right w:val="none" w:color="FFFFFF" w:sz="0"/>
+            </w:tcBorders>
+            <w:tcMar>
+              <w:top w:type="dxa" w:w="80"/>
+              <w:left w:type="dxa" w:w="110"/>
+              <w:bottom w:type="dxa" w:w="80"/>
+              <w:right w:type="dxa" w:w="110"/>
+            </w:tcMar>
+          </w:tcPr>
+          <w:p>
+            <w:pPr>
+              <w:spacing w:after="40" w:line="270"/>
+            </w:pPr>
+            <w:r>
+              <w:rPr>
+                <w:rFonts w:ascii="Calibri" w:cs="Calibri" w:eastAsia="Calibri" w:hAnsi="Calibri"/>
+                <w:b/>
+                <w:bCs/>
+                <w:color w:val="1D1D1B"/>
+                <w:sz w:val="21"/>
+                <w:szCs w:val="21"/>
+              </w:rPr>
+              <w:t xml:space="preserve">User</w:t>
+            </w:r>
+          </w:p>
+        </w:tc>
+        <w:tc>
+          <w:tcPr>
+            <w:tcW w:type="dxa" w:w="6760"/>
+            <w:tcBorders>
+              <w:top w:val="single" w:color="D9CFC9" w:sz="4"/>
+              <w:left w:val="none" w:color="FFFFFF" w:sz="0"/>
+              <w:bottom w:val="single" w:color="D9CFC9" w:sz="4"/>
+              <w:right w:val="none" w:color="FFFFFF" w:sz="0"/>
+            </w:tcBorders>
+            <w:tcMar>
+              <w:top w:type="dxa" w:w="80"/>
+              <w:left w:type="dxa" w:w="110"/>
+              <w:bottom w:type="dxa" w:w="80"/>
+              <w:right w:type="dxa" w:w="110"/>
+            </w:tcMar>
+          </w:tcPr>
+          <w:p>
+            <w:pPr>
+              <w:spacing w:after="40" w:line="270"/>
+            </w:pPr>
+            <w:r>
+              <w:rPr>
+                <w:rFonts w:ascii="Calibri" w:cs="Calibri" w:eastAsia="Calibri" w:hAnsi="Calibri"/>
+                <w:color w:val="1D1D1B"/>
+                <w:sz w:val="21"/>
+                <w:szCs w:val="21"/>
+              </w:rPr>
+              <w:t xml:space="preserve">Health and fitness club with pool, spa, studios, racquet and sports hall uses, treatment rooms, members' lounge, restaurant, bar and café, children's and family facilities, retail ancillary to the club, events and hospitality in the Pavilion, and the astro pitch for sport, within Class E and F2 as appropriate, and any other use within Class E with consent not to be unreasonably withheld.</w:t>
+            </w:r>
+          </w:p>
+        </w:tc>
+      </w:tr>
+      <w:tr>
+        <w:tc>
+          <w:tcPr>
+            <w:tcW w:type="dxa" w:w="2600"/>
+            <w:tcBorders>
+              <w:top w:val="single" w:color="D9CFC9" w:sz="4"/>
+              <w:left w:val="none" w:color="FFFFFF" w:sz="0"/>
+              <w:bottom w:val="single" w:color="D9CFC9" w:sz="4"/>
+              <w:right w:val="none" w:color="FFFFFF" w:sz="0"/>
+            </w:tcBorders>
+            <w:tcMar>
+              <w:top w:type="dxa" w:w="80"/>
+              <w:left w:type="dxa" w:w="110"/>
+              <w:bottom w:type="dxa" w:w="80"/>
+              <w:right w:type="dxa" w:w="110"/>
+            </w:tcMar>
+          </w:tcPr>
+          <w:p>
+            <w:pPr>
+              <w:spacing w:after="40" w:line="270"/>
+            </w:pPr>
+            <w:r>
+              <w:rPr>
+                <w:rFonts w:ascii="Calibri" w:cs="Calibri" w:eastAsia="Calibri" w:hAnsi="Calibri"/>
+                <w:b/>
+                <w:bCs/>
+                <w:color w:val="1D1D1B"/>
+                <w:sz w:val="21"/>
+                <w:szCs w:val="21"/>
+              </w:rPr>
+              <w:t xml:space="preserve">Alterations</w:t>
+            </w:r>
+          </w:p>
+        </w:tc>
+        <w:tc>
+          <w:tcPr>
+            <w:tcW w:type="dxa" w:w="6760"/>
+            <w:tcBorders>
+              <w:top w:val="single" w:color="D9CFC9" w:sz="4"/>
+              <w:left w:val="none" w:color="FFFFFF" w:sz="0"/>
+              <w:bottom w:val="single" w:color="D9CFC9" w:sz="4"/>
+              <w:right w:val="none" w:color="FFFFFF" w:sz="0"/>
+            </w:tcBorders>
+            <w:tcMar>
+              <w:top w:type="dxa" w:w="80"/>
+              <w:left w:type="dxa" w:w="110"/>
+              <w:bottom w:type="dxa" w:w="80"/>
+              <w:right w:type="dxa" w:w="110"/>
+            </w:tcMar>
+          </w:tcPr>
+          <w:p>
+            <w:pPr>
+              <w:spacing w:after="40" w:line="270"/>
+            </w:pPr>
+            <w:r>
+              <w:rPr>
+                <w:rFonts w:ascii="Calibri" w:cs="Calibri" w:eastAsia="Calibri" w:hAnsi="Calibri"/>
+                <w:color w:val="1D1D1B"/>
+                <w:sz w:val="21"/>
+                <w:szCs w:val="21"/>
+              </w:rPr>
+              <w:t xml:space="preserve">Non-structural internal alterations and the initial fit-out without consent on notice; structural and external alterations with consent not to be unreasonably withheld; signage to the Tenant's corporate standard on both buildings and at Gate 2 with consent not to be unreasonably withheld.</w:t>
+            </w:r>
+          </w:p>
+        </w:tc>
+      </w:tr>
+      <w:tr>
+        <w:tc>
+          <w:tcPr>
+            <w:tcW w:type="dxa" w:w="2600"/>
+            <w:tcBorders>
+              <w:top w:val="single" w:color="D9CFC9" w:sz="4"/>
+              <w:left w:val="none" w:color="FFFFFF" w:sz="0"/>
+              <w:bottom w:val="single" w:color="D9CFC9" w:sz="4"/>
+              <w:right w:val="none" w:color="FFFFFF" w:sz="0"/>
+            </w:tcBorders>
+            <w:tcMar>
+              <w:top w:type="dxa" w:w="80"/>
+              <w:left w:type="dxa" w:w="110"/>
+              <w:bottom w:type="dxa" w:w="80"/>
+              <w:right w:type="dxa" w:w="110"/>
+            </w:tcMar>
+          </w:tcPr>
+          <w:p>
+            <w:pPr>
+              <w:spacing w:after="40" w:line="270"/>
+            </w:pPr>
+            <w:r>
+              <w:rPr>
+                <w:rFonts w:ascii="Calibri" w:cs="Calibri" w:eastAsia="Calibri" w:hAnsi="Calibri"/>
+                <w:b/>
+                <w:bCs/>
+                <w:color w:val="1D1D1B"/>
+                <w:sz w:val="21"/>
+                <w:szCs w:val="21"/>
+              </w:rPr>
+              <w:t xml:space="preserve">1954 Act</w:t>
+            </w:r>
+          </w:p>
+        </w:tc>
+        <w:tc>
+          <w:tcPr>
+            <w:tcW w:type="dxa" w:w="6760"/>
+            <w:tcBorders>
+              <w:top w:val="single" w:color="D9CFC9" w:sz="4"/>
+              <w:left w:val="none" w:color="FFFFFF" w:sz="0"/>
+              <w:bottom w:val="single" w:color="D9CFC9" w:sz="4"/>
+              <w:right w:val="none" w:color="FFFFFF" w:sz="0"/>
+            </w:tcBorders>
+            <w:tcMar>
+              <w:top w:type="dxa" w:w="80"/>
+              <w:left w:type="dxa" w:w="110"/>
+              <w:bottom w:type="dxa" w:w="80"/>
+              <w:right w:type="dxa" w:w="110"/>
+            </w:tcMar>
+          </w:tcPr>
+          <w:p>
+            <w:pPr>
+              <w:spacing w:after="40" w:line="270"/>
+            </w:pPr>
+            <w:r>
+              <w:rPr>
+                <w:rFonts w:ascii="Calibri" w:cs="Calibri" w:eastAsia="Calibri" w:hAnsi="Calibri"/>
+                <w:color w:val="1D1D1B"/>
+                <w:sz w:val="21"/>
+                <w:szCs w:val="21"/>
+              </w:rPr>
+              <w:t xml:space="preserve">Inside the Act.</w:t>
+            </w:r>
+          </w:p>
+        </w:tc>
+      </w:tr>
+      <w:tr>
+        <w:tc>
+          <w:tcPr>
+            <w:tcW w:type="dxa" w:w="2600"/>
+            <w:tcBorders>
+              <w:top w:val="single" w:color="D9CFC9" w:sz="4"/>
+              <w:left w:val="none" w:color="FFFFFF" w:sz="0"/>
+              <w:bottom w:val="single" w:color="D9CFC9" w:sz="4"/>
+              <w:right w:val="none" w:color="FFFFFF" w:sz="0"/>
+            </w:tcBorders>
+            <w:tcMar>
+              <w:top w:type="dxa" w:w="80"/>
+              <w:left w:type="dxa" w:w="110"/>
+              <w:bottom w:type="dxa" w:w="80"/>
+              <w:right w:type="dxa" w:w="110"/>
+            </w:tcMar>
+          </w:tcPr>
+          <w:p>
+            <w:pPr>
+              <w:spacing w:after="40" w:line="270"/>
+            </w:pPr>
+            <w:r>
+              <w:rPr>
+                <w:rFonts w:ascii="Calibri" w:cs="Calibri" w:eastAsia="Calibri" w:hAnsi="Calibri"/>
+                <w:b/>
+                <w:bCs/>
+                <w:color w:val="1D1D1B"/>
+                <w:sz w:val="21"/>
+                <w:szCs w:val="21"/>
+              </w:rPr>
+              <w:t xml:space="preserve">Costs and VAT</w:t>
+            </w:r>
+          </w:p>
+        </w:tc>
+        <w:tc>
+          <w:tcPr>
+            <w:tcW w:type="dxa" w:w="6760"/>
+            <w:tcBorders>
+              <w:top w:val="single" w:color="D9CFC9" w:sz="4"/>
+              <w:left w:val="none" w:color="FFFFFF" w:sz="0"/>
+              <w:bottom w:val="single" w:color="D9CFC9" w:sz="4"/>
+              <w:right w:val="none" w:color="FFFFFF" w:sz="0"/>
+            </w:tcBorders>
+            <w:tcMar>
+              <w:top w:type="dxa" w:w="80"/>
+              <w:left w:type="dxa" w:w="110"/>
+              <w:bottom w:type="dxa" w:w="80"/>
+              <w:right w:type="dxa" w:w="110"/>
+            </w:tcMar>
+          </w:tcPr>
+          <w:p>
+            <w:pPr>
+              <w:spacing w:after="40" w:line="270"/>
+            </w:pPr>
+            <w:r>
+              <w:rPr>
+                <w:rFonts w:ascii="Calibri" w:cs="Calibri" w:eastAsia="Calibri" w:hAnsi="Calibri"/>
+                <w:color w:val="1D1D1B"/>
+                <w:sz w:val="21"/>
+                <w:szCs w:val="21"/>
+              </w:rPr>
+              <w:t xml:space="preserve">Each party bears its own legal and professional costs. Rents exclusive of VAT; the Landlord will not opt to tax without the Tenant's agreement, or will indemnify the Tenant for irrecoverable VAT.</w:t>
+            </w:r>
+          </w:p>
+        </w:tc>
+      </w:tr>
+      <w:tr>
+        <w:tc>
+          <w:tcPr>
+            <w:tcW w:type="dxa" w:w="2600"/>
+            <w:tcBorders>
+              <w:top w:val="single" w:color="D9CFC9" w:sz="4"/>
+              <w:left w:val="none" w:color="FFFFFF" w:sz="0"/>
+              <w:bottom w:val="single" w:color="D9CFC9" w:sz="4"/>
+              <w:right w:val="none" w:color="FFFFFF" w:sz="0"/>
+            </w:tcBorders>
+            <w:tcMar>
+              <w:top w:type="dxa" w:w="80"/>
+              <w:left w:type="dxa" w:w="110"/>
+              <w:bottom w:type="dxa" w:w="80"/>
+              <w:right w:type="dxa" w:w="110"/>
+            </w:tcMar>
+          </w:tcPr>
+          <w:p>
+            <w:pPr>
+              <w:spacing w:after="40" w:line="270"/>
+            </w:pPr>
+            <w:r>
+              <w:rPr>
+                <w:rFonts w:ascii="Calibri" w:cs="Calibri" w:eastAsia="Calibri" w:hAnsi="Calibri"/>
+                <w:b/>
+                <w:bCs/>
+                <w:color w:val="1D1D1B"/>
+                <w:sz w:val="21"/>
+                <w:szCs w:val="21"/>
+              </w:rPr>
+              <w:t xml:space="preserve">Lease start</w:t>
+            </w:r>
+          </w:p>
+        </w:tc>
+        <w:tc>
+          <w:tcPr>
+            <w:tcW w:type="dxa" w:w="6760"/>
+            <w:tcBorders>
+              <w:top w:val="single" w:color="D9CFC9" w:sz="4"/>
+              <w:left w:val="none" w:color="FFFFFF" w:sz="0"/>
+              <w:bottom w:val="single" w:color="D9CFC9" w:sz="4"/>
+              <w:right w:val="none" w:color="FFFFFF" w:sz="0"/>
+            </w:tcBorders>
+            <w:tcMar>
+              <w:top w:type="dxa" w:w="80"/>
+              <w:left w:type="dxa" w:w="110"/>
+              <w:bottom w:type="dxa" w:w="80"/>
+              <w:right w:type="dxa" w:w="110"/>
+            </w:tcMar>
+          </w:tcPr>
+          <w:p>
+            <w:pPr>
+              <w:spacing w:after="40" w:line="270"/>
+            </w:pPr>
+            <w:r>
+              <w:rPr>
+                <w:rFonts w:ascii="Calibri" w:cs="Calibri" w:eastAsia="Calibri" w:hAnsi="Calibri"/>
+                <w:color w:val="1D1D1B"/>
+                <w:sz w:val="21"/>
+                <w:szCs w:val="21"/>
+              </w:rPr>
+              <w:t xml:space="preserve">On practical completion of the Landlord's Works and handover of the premises, targeted for the second quarter of 2027. The agreement for lease exchanges with the Landlord's purchase (target completion January 2027) and the All England Club's surrender and regrant complete the same day, so the Landlord's Works can start immediately. A January 2027 lease start is not achievable; the works will take a minimum of three months.</w:t>
+            </w:r>
+          </w:p>
+        </w:tc>
+      </w:tr>
+      <w:tr>
+        <w:tc>
+          <w:tcPr>
+            <w:tcW w:type="dxa" w:w="2600"/>
+            <w:tcBorders>
+              <w:top w:val="single" w:color="D9CFC9" w:sz="4"/>
+              <w:left w:val="none" w:color="FFFFFF" w:sz="0"/>
+              <w:bottom w:val="single" w:color="D9CFC9" w:sz="4"/>
+              <w:right w:val="none" w:color="FFFFFF" w:sz="0"/>
+            </w:tcBorders>
+            <w:tcMar>
+              <w:top w:type="dxa" w:w="80"/>
+              <w:left w:type="dxa" w:w="110"/>
+              <w:bottom w:type="dxa" w:w="80"/>
+              <w:right w:type="dxa" w:w="110"/>
+            </w:tcMar>
+          </w:tcPr>
+          <w:p>
+            <w:pPr>
+              <w:spacing w:after="40" w:line="270"/>
+            </w:pPr>
+            <w:r>
+              <w:rPr>
+                <w:rFonts w:ascii="Calibri" w:cs="Calibri" w:eastAsia="Calibri" w:hAnsi="Calibri"/>
+                <w:b/>
+                <w:bCs/>
+                <w:color w:val="1D1D1B"/>
+                <w:sz w:val="21"/>
+                <w:szCs w:val="21"/>
+              </w:rPr>
+              <w:t xml:space="preserve">Rent</w:t>
+            </w:r>
+          </w:p>
+        </w:tc>
+        <w:tc>
+          <w:tcPr>
+            <w:tcW w:type="dxa" w:w="6760"/>
+            <w:tcBorders>
+              <w:top w:val="single" w:color="D9CFC9" w:sz="4"/>
+              <w:left w:val="none" w:color="FFFFFF" w:sz="0"/>
+              <w:bottom w:val="single" w:color="D9CFC9" w:sz="4"/>
+              <w:right w:val="none" w:color="FFFFFF" w:sz="0"/>
+            </w:tcBorders>
+            <w:tcMar>
+              <w:top w:type="dxa" w:w="80"/>
+              <w:left w:type="dxa" w:w="110"/>
+              <w:bottom w:type="dxa" w:w="80"/>
+              <w:right w:type="dxa" w:w="110"/>
+            </w:tcMar>
+          </w:tcPr>
+          <w:p>
+            <w:pPr>
+              <w:spacing w:after="40" w:line="270"/>
+            </w:pPr>
+            <w:r>
+              <w:rPr>
+                <w:rFonts w:ascii="Calibri" w:cs="Calibri" w:eastAsia="Calibri" w:hAnsi="Calibri"/>
+                <w:color w:val="1D1D1B"/>
+                <w:sz w:val="21"/>
+                <w:szCs w:val="21"/>
+              </w:rPr>
+              <w:t xml:space="preserve">£1,804,260 per annum exclusive, being £30.00 per sq ft GIA on 60,142 sq ft. The astro pitch and strip are included at no additional rent.</w:t>
+            </w:r>
+          </w:p>
+        </w:tc>
+      </w:tr>
+      <w:tr>
+        <w:tc>
+          <w:tcPr>
+            <w:tcW w:type="dxa" w:w="2600"/>
+            <w:tcBorders>
+              <w:top w:val="single" w:color="D9CFC9" w:sz="4"/>
+              <w:left w:val="none" w:color="FFFFFF" w:sz="0"/>
+              <w:bottom w:val="single" w:color="D9CFC9" w:sz="4"/>
+              <w:right w:val="none" w:color="FFFFFF" w:sz="0"/>
+            </w:tcBorders>
+            <w:tcMar>
+              <w:top w:type="dxa" w:w="80"/>
+              <w:left w:type="dxa" w:w="110"/>
+              <w:bottom w:type="dxa" w:w="80"/>
+              <w:right w:type="dxa" w:w="110"/>
+            </w:tcMar>
+          </w:tcPr>
+          <w:p>
+            <w:pPr>
+              <w:spacing w:after="40" w:line="270"/>
+            </w:pPr>
+            <w:r>
+              <w:rPr>
+                <w:rFonts w:ascii="Calibri" w:cs="Calibri" w:eastAsia="Calibri" w:hAnsi="Calibri"/>
+                <w:b/>
+                <w:bCs/>
+                <w:color w:val="1D1D1B"/>
+                <w:sz w:val="21"/>
+                <w:szCs w:val="21"/>
+              </w:rPr>
+              <w:t xml:space="preserve">Rent free</w:t>
+            </w:r>
+          </w:p>
+        </w:tc>
+        <w:tc>
+          <w:tcPr>
+            <w:tcW w:type="dxa" w:w="6760"/>
+            <w:tcBorders>
+              <w:top w:val="single" w:color="D9CFC9" w:sz="4"/>
+              <w:left w:val="none" w:color="FFFFFF" w:sz="0"/>
+              <w:bottom w:val="single" w:color="D9CFC9" w:sz="4"/>
+              <w:right w:val="none" w:color="FFFFFF" w:sz="0"/>
+            </w:tcBorders>
+            <w:tcMar>
+              <w:top w:type="dxa" w:w="80"/>
+              <w:left w:type="dxa" w:w="110"/>
+              <w:bottom w:type="dxa" w:w="80"/>
+              <w:right w:type="dxa" w:w="110"/>
+            </w:tcMar>
+          </w:tcPr>
+          <w:p>
+            <w:pPr>
+              <w:spacing w:after="40" w:line="270"/>
+            </w:pPr>
+            <w:r>
+              <w:rPr>
+                <w:rFonts w:ascii="Calibri" w:cs="Calibri" w:eastAsia="Calibri" w:hAnsi="Calibri"/>
+                <w:color w:val="1D1D1B"/>
+                <w:sz w:val="21"/>
+                <w:szCs w:val="21"/>
+              </w:rPr>
+              <w:t xml:space="preserve">12 months from the lease start.</w:t>
+            </w:r>
+          </w:p>
+        </w:tc>
+      </w:tr>
+      <w:tr>
+        <w:tc>
+          <w:tcPr>
+            <w:tcW w:type="dxa" w:w="2600"/>
+            <w:tcBorders>
+              <w:top w:val="single" w:color="D9CFC9" w:sz="4"/>
+              <w:left w:val="none" w:color="FFFFFF" w:sz="0"/>
+              <w:bottom w:val="single" w:color="D9CFC9" w:sz="4"/>
+              <w:right w:val="none" w:color="FFFFFF" w:sz="0"/>
+            </w:tcBorders>
+            <w:tcMar>
+              <w:top w:type="dxa" w:w="80"/>
+              <w:left w:type="dxa" w:w="110"/>
+              <w:bottom w:type="dxa" w:w="80"/>
+              <w:right w:type="dxa" w:w="110"/>
+            </w:tcMar>
+          </w:tcPr>
+          <w:p>
+            <w:pPr>
+              <w:spacing w:after="40" w:line="270"/>
+            </w:pPr>
+            <w:r>
+              <w:rPr>
+                <w:rFonts w:ascii="Calibri" w:cs="Calibri" w:eastAsia="Calibri" w:hAnsi="Calibri"/>
+                <w:b/>
+                <w:bCs/>
+                <w:color w:val="1D1D1B"/>
+                <w:sz w:val="21"/>
+                <w:szCs w:val="21"/>
+              </w:rPr>
               <w:t xml:space="preserve">Capital contribution</w:t>
             </w:r>
           </w:p>
@@ -1426,7 +1954,7 @@
                 <w:sz w:val="21"/>
                 <w:szCs w:val="21"/>
               </w:rPr>
-              <w:t xml:space="preserve">A sum equal to one year's rent, £1,804,260, paid by the Landlord to the Tenant on completion of the lease, towards the Tenant's fit-out. The Landlord makes no further contribution and carries out no works.</w:t>
+              <w:t xml:space="preserve">A sum equal to two years' rent, £3,608,520, paid by the Landlord to the Tenant on completion of the lease, towards the Tenant's fit-out, in addition to the Landlord's Works below.</w:t>
             </w:r>
           </w:p>
         </w:tc>
@@ -2093,7 +2621,7 @@
           <w:sz w:val="21"/>
           <w:szCs w:val="21"/>
         </w:rPr>
-        <w:t xml:space="preserve">Landlord's works: none. The buildings are handed over on completion as they stand, with vacant possession from the Club. Severance of the temporary pavilion, separation of services and removal of the Club's fixtures are for the Tenant within its fit-out, funded by the capital contribution; the Landlord will procure the Club's cooperation under the surrender.</w:t>
+        <w:t xml:space="preserve">Landlord's Works, to a developer's shell specification to be agreed: (a) Pavilion: strip out the internal partitions to give clear open-plan floors, remove the Club's fixtures, sever and make good the junction with the temporary pavilion; (b) a new ground-floor link between the Pavilion and the Sports Club, or complete recladding of the existing bridge link; (c) Sports Club: strip back to the developer's shell, removing most partition walls to create fewer, larger spaces; (d) external works to both buildings so that the roofs, glazing and elevations are fit for a 20-year term, including the appearance of the Sports Club roof and glazing; (e) separation of services and new incoming supplies as required. Programme a minimum of three months from completion of the Landlord's purchase. Allowance in the Landlord's appraisal: [£130 per sq ft], based on the fabric items in the Lighthouse Surveyors vendor's survey annexed to the 2021 lease (roofs, windows, cladding and consequential fabric repair, £2.5m on the Pavilion and £3.0m on the Sports Club at 2019 prices), to be confirmed by a quantity surveyor. Mechanical and electrical renewal is for the Tenant's fit-out, funded by the capital contribution.</w:t>
       </w:r>
     </w:p>
     <w:p>
@@ -2112,7 +2640,7 @@
           <w:sz w:val="21"/>
           <w:szCs w:val="21"/>
         </w:rPr>
-        <w:t xml:space="preserve">Tenant's works: full fit-out to Third Space specification, including the pool and spa refurbishment, studios, gym floor and the Pavilion conversion, funded by the Tenant with the capital contribution. Licence for alterations granted with the lease. The fit-out falls within the 24-month rent-free.</w:t>
+        <w:t xml:space="preserve">Tenant's works: full fit-out to Third Space specification from the developer's shell, including the pool and spa refurbishment, studios, gym floor and the Pavilion conversion, funded by the Tenant with the capital contribution. Licence for alterations granted with the lease. The fit-out falls within the rent-free.</w:t>
       </w:r>
     </w:p>
     <w:p>
@@ -2487,7 +3015,7 @@
           <w:sz w:val="21"/>
           <w:szCs w:val="21"/>
         </w:rPr>
-        <w:t xml:space="preserve">The lease completes on the same day as, and conditional upon, (a) the Landlord's purchase of the estate and (b) the surrender of the All England Club's existing lease and the regrant of a lease of the playing fields only. Agreement for lease exchanged with the Landlord's purchase contract; long-stop date [30 June 2027].</w:t>
+        <w:t xml:space="preserve">Agreement for lease conditional upon (a) the Landlord's purchase of the estate, (b) the surrender of the All England Club's existing lease and the regrant of a lease of the playing fields only, and (c) practical completion of the Landlord's Works. Exchanged with the Landlord's purchase contract; long-stop date [31 December 2027].</w:t>
       </w:r>
     </w:p>
     <w:p>
@@ -2754,7 +3282,7 @@
                 <w:sz w:val="21"/>
                 <w:szCs w:val="21"/>
               </w:rPr>
-              <w:t xml:space="preserve">Completion: purchase, surrender and regrant, lease and capital contribution, all one day</w:t>
+              <w:t xml:space="preserve">Completion of the purchase; surrender and regrant; Landlord's Works start</w:t>
             </w:r>
           </w:p>
         </w:tc>
@@ -2818,7 +3346,7 @@
                 <w:sz w:val="21"/>
                 <w:szCs w:val="21"/>
               </w:rPr>
-              <w:t xml:space="preserve">Tenant's fit-out</w:t>
+              <w:t xml:space="preserve">Practical completion of the Landlord's Works; lease completes; capital contribution paid</w:t>
             </w:r>
           </w:p>
         </w:tc>
@@ -2849,7 +3377,7 @@
                 <w:sz w:val="21"/>
                 <w:szCs w:val="21"/>
               </w:rPr>
-              <w:t xml:space="preserve">2027, within the rent-free</w:t>
+              <w:t xml:space="preserve">Target April 2027</w:t>
             </w:r>
           </w:p>
         </w:tc>
@@ -2882,7 +3410,7 @@
                 <w:sz w:val="21"/>
                 <w:szCs w:val="21"/>
               </w:rPr>
-              <w:t xml:space="preserve">Rent commences</w:t>
+              <w:t xml:space="preserve">Tenant's fit-out</w:t>
             </w:r>
           </w:p>
         </w:tc>
@@ -2913,7 +3441,7 @@
                 <w:sz w:val="21"/>
                 <w:szCs w:val="21"/>
               </w:rPr>
-              <w:t xml:space="preserve">1 January 2029</w:t>
+              <w:t xml:space="preserve">2027, within the rent-free</w:t>
             </w:r>
           </w:p>
         </w:tc>
@@ -2946,6 +3474,70 @@
                 <w:sz w:val="21"/>
                 <w:szCs w:val="21"/>
               </w:rPr>
+              <w:t xml:space="preserve">Rent commences</w:t>
+            </w:r>
+          </w:p>
+        </w:tc>
+        <w:tc>
+          <w:tcPr>
+            <w:tcW w:type="dxa" w:w="4680"/>
+            <w:tcBorders>
+              <w:top w:val="single" w:color="D9CFC9" w:sz="4"/>
+              <w:left w:val="none" w:color="FFFFFF" w:sz="0"/>
+              <w:bottom w:val="single" w:color="D9CFC9" w:sz="4"/>
+              <w:right w:val="none" w:color="FFFFFF" w:sz="0"/>
+            </w:tcBorders>
+            <w:tcMar>
+              <w:top w:type="dxa" w:w="80"/>
+              <w:left w:type="dxa" w:w="110"/>
+              <w:bottom w:type="dxa" w:w="80"/>
+              <w:right w:type="dxa" w:w="110"/>
+            </w:tcMar>
+          </w:tcPr>
+          <w:p>
+            <w:pPr>
+              <w:spacing w:after="40" w:line="270"/>
+            </w:pPr>
+            <w:r>
+              <w:rPr>
+                <w:rFonts w:ascii="Calibri" w:cs="Calibri" w:eastAsia="Calibri" w:hAnsi="Calibri"/>
+                <w:color w:val="1D1D1B"/>
+                <w:sz w:val="21"/>
+                <w:szCs w:val="21"/>
+              </w:rPr>
+              <w:t xml:space="preserve">12 months from the lease start, target April 2028</w:t>
+            </w:r>
+          </w:p>
+        </w:tc>
+      </w:tr>
+      <w:tr>
+        <w:tc>
+          <w:tcPr>
+            <w:tcW w:type="dxa" w:w="4680"/>
+            <w:tcBorders>
+              <w:top w:val="single" w:color="D9CFC9" w:sz="4"/>
+              <w:left w:val="none" w:color="FFFFFF" w:sz="0"/>
+              <w:bottom w:val="single" w:color="D9CFC9" w:sz="4"/>
+              <w:right w:val="none" w:color="FFFFFF" w:sz="0"/>
+            </w:tcBorders>
+            <w:tcMar>
+              <w:top w:type="dxa" w:w="80"/>
+              <w:left w:type="dxa" w:w="110"/>
+              <w:bottom w:type="dxa" w:w="80"/>
+              <w:right w:type="dxa" w:w="110"/>
+            </w:tcMar>
+          </w:tcPr>
+          <w:p>
+            <w:pPr>
+              <w:spacing w:after="40" w:line="270"/>
+            </w:pPr>
+            <w:r>
+              <w:rPr>
+                <w:rFonts w:ascii="Calibri" w:cs="Calibri" w:eastAsia="Calibri" w:hAnsi="Calibri"/>
+                <w:color w:val="1D1D1B"/>
+                <w:sz w:val="21"/>
+                <w:szCs w:val="21"/>
+              </w:rPr>
               <w:t xml:space="preserve">First rent review</w:t>
             </w:r>
           </w:p>
@@ -2977,7 +3569,7 @@
                 <w:sz w:val="21"/>
                 <w:szCs w:val="21"/>
               </w:rPr>
-              <w:t xml:space="preserve">January 2032</w:t>
+              <w:t xml:space="preserve">Fifth anniversary of the lease start, 2032</w:t>
             </w:r>
           </w:p>
         </w:tc>

</xml_diff>